<commit_message>
Add 20 system-design reference solutions with architecture diagrams
- system-design/SD-01..SD-20: each with requirements, a Mermaid architecture
  diagram (validated via mermaid-cli, renders on GitHub), deep dive on the named
  focus areas, trade-offs, and a 30-second recall table
- system-design/README.md: indexed table of all 20 + AI variants + anchor problems
- Interview-Cram-Sheet.md/.docx: filled the "The 20" section with a one-line
  recall table for every problem
- PROGRESS-DASHBOARD.md: linked each SD checklist item to its solution
- save-session command: append mock-round notes to the reference file, don't overwrite

Source: System_Design_Interview_Playbook.docx

Co-Authored-By: Claude Sonnet 5 <noreply@anthropic.com>
Claude-Session: https://claude.ai/code/session_015Xsa77vkoEkNeBFKbxMP9F
</commit_message>
<xml_diff>
--- a/Interview-Cram-Sheet.docx
+++ b/Interview-Cram-Sheet.docx
@@ -2157,31 +2157,1131 @@
         <w:pStyle w:val="Heading3"/>
       </w:pPr>
       <w:r>
-        <w:t>The 20 — status</w:t>
+        <w:t>The 20 — one-line recall</w:t>
       </w:r>
     </w:p>
     <w:p>
-      <w:pPr>
-        <w:ind w:left="240"/>
-      </w:pPr>
+      <w:r>
+        <w:t>Full solution + architecture diagram for each: [</w:t>
+      </w:r>
       <w:r>
         <w:rPr>
-          <w:i/>
+          <w:rFonts w:ascii="Consolas" w:hAnsi="Consolas"/>
+          <w:color w:val="B03060"/>
         </w:rPr>
-        <w:t>⏳ Each problem gets a 4-line summary here after you study it (requirements twist ·</w:t>
+        <w:t>system-design/</w:t>
+      </w:r>
+      <w:r>
+        <w:t>](system-design/README.md).</w:t>
       </w:r>
     </w:p>
-    <w:p>
-      <w:pPr>
-        <w:ind w:left="240"/>
-      </w:pPr>
-      <w:r>
-        <w:rPr>
-          <w:i/>
-        </w:rPr>
-        <w:t>key design choice · main bottleneck · the tradeoff they push on).</w:t>
-      </w:r>
-    </w:p>
+    <w:tbl>
+      <w:tblPr>
+        <w:tblStyle w:val="LightGrid-Accent1"/>
+        <w:tblW w:type="auto" w:w="0"/>
+        <w:tblLook w:firstColumn="1" w:firstRow="1" w:lastColumn="0" w:lastRow="0" w:noHBand="0" w:noVBand="1" w:val="04A0"/>
+      </w:tblPr>
+      <w:tblGrid>
+        <w:gridCol w:w="2160"/>
+        <w:gridCol w:w="2160"/>
+        <w:gridCol w:w="2160"/>
+        <w:gridCol w:w="2160"/>
+      </w:tblGrid>
+      <w:tr>
+        <w:tc>
+          <w:tcPr>
+            <w:tcW w:type="dxa" w:w="2160"/>
+          </w:tcPr>
+          <w:p>
+            <w:r>
+              <w:rPr>
+                <w:b/>
+              </w:rPr>
+            </w:r>
+            <w:r>
+              <w:rPr>
+                <w:b/>
+              </w:rPr>
+              <w:t>#</w:t>
+            </w:r>
+          </w:p>
+        </w:tc>
+        <w:tc>
+          <w:tcPr>
+            <w:tcW w:type="dxa" w:w="2160"/>
+          </w:tcPr>
+          <w:p>
+            <w:r>
+              <w:rPr>
+                <w:b/>
+              </w:rPr>
+            </w:r>
+            <w:r>
+              <w:rPr>
+                <w:b/>
+              </w:rPr>
+              <w:t>Problem</w:t>
+            </w:r>
+          </w:p>
+        </w:tc>
+        <w:tc>
+          <w:tcPr>
+            <w:tcW w:type="dxa" w:w="2160"/>
+          </w:tcPr>
+          <w:p>
+            <w:r>
+              <w:rPr>
+                <w:b/>
+              </w:rPr>
+            </w:r>
+            <w:r>
+              <w:rPr>
+                <w:b/>
+              </w:rPr>
+              <w:t>Key design choice</w:t>
+            </w:r>
+          </w:p>
+        </w:tc>
+        <w:tc>
+          <w:tcPr>
+            <w:tcW w:type="dxa" w:w="2160"/>
+          </w:tcPr>
+          <w:p>
+            <w:r>
+              <w:rPr>
+                <w:b/>
+              </w:rPr>
+            </w:r>
+            <w:r>
+              <w:rPr>
+                <w:b/>
+              </w:rPr>
+              <w:t>Main bottleneck / trade-off</w:t>
+            </w:r>
+          </w:p>
+        </w:tc>
+      </w:tr>
+      <w:tr>
+        <w:tc>
+          <w:tcPr>
+            <w:tcW w:type="dxa" w:w="2160"/>
+          </w:tcPr>
+          <w:p>
+            <w:r/>
+            <w:r>
+              <w:t>1</w:t>
+            </w:r>
+          </w:p>
+        </w:tc>
+        <w:tc>
+          <w:tcPr>
+            <w:tcW w:type="dxa" w:w="2160"/>
+          </w:tcPr>
+          <w:p>
+            <w:r/>
+            <w:r>
+              <w:rPr>
+                <w:b/>
+              </w:rPr>
+              <w:t>URL Shortener</w:t>
+            </w:r>
+          </w:p>
+        </w:tc>
+        <w:tc>
+          <w:tcPr>
+            <w:tcW w:type="dxa" w:w="2160"/>
+          </w:tcPr>
+          <w:p>
+            <w:r/>
+            <w:r>
+              <w:t>Pre-generated key pool — write path never hits the DB for a code</w:t>
+            </w:r>
+          </w:p>
+        </w:tc>
+        <w:tc>
+          <w:tcPr>
+            <w:tcW w:type="dxa" w:w="2160"/>
+          </w:tcPr>
+          <w:p>
+            <w:r/>
+            <w:r>
+              <w:t>Single-region redirect latency for global users → CDN</w:t>
+            </w:r>
+          </w:p>
+        </w:tc>
+      </w:tr>
+      <w:tr>
+        <w:tc>
+          <w:tcPr>
+            <w:tcW w:type="dxa" w:w="2160"/>
+          </w:tcPr>
+          <w:p>
+            <w:r/>
+            <w:r>
+              <w:t>2</w:t>
+            </w:r>
+          </w:p>
+        </w:tc>
+        <w:tc>
+          <w:tcPr>
+            <w:tcW w:type="dxa" w:w="2160"/>
+          </w:tcPr>
+          <w:p>
+            <w:r/>
+            <w:r>
+              <w:rPr>
+                <w:b/>
+              </w:rPr>
+              <w:t>Rate Limiter</w:t>
+            </w:r>
+          </w:p>
+        </w:tc>
+        <w:tc>
+          <w:tcPr>
+            <w:tcW w:type="dxa" w:w="2160"/>
+          </w:tcPr>
+          <w:p>
+            <w:r/>
+            <w:r>
+              <w:t>Externalised atomic counter in Redis (</w:t>
+            </w:r>
+            <w:r>
+              <w:rPr>
+                <w:rFonts w:ascii="Consolas" w:hAnsi="Consolas"/>
+                <w:color w:val="B03060"/>
+              </w:rPr>
+              <w:t>INCR</w:t>
+            </w:r>
+            <w:r>
+              <w:t>), token bucket</w:t>
+            </w:r>
+          </w:p>
+        </w:tc>
+        <w:tc>
+          <w:tcPr>
+            <w:tcW w:type="dxa" w:w="2160"/>
+          </w:tcPr>
+          <w:p>
+            <w:r/>
+            <w:r>
+              <w:t>Redis throughput → shard keys by client_id; fail open</w:t>
+            </w:r>
+          </w:p>
+        </w:tc>
+      </w:tr>
+      <w:tr>
+        <w:tc>
+          <w:tcPr>
+            <w:tcW w:type="dxa" w:w="2160"/>
+          </w:tcPr>
+          <w:p>
+            <w:r/>
+            <w:r>
+              <w:t>3</w:t>
+            </w:r>
+          </w:p>
+        </w:tc>
+        <w:tc>
+          <w:tcPr>
+            <w:tcW w:type="dxa" w:w="2160"/>
+          </w:tcPr>
+          <w:p>
+            <w:r/>
+            <w:r>
+              <w:rPr>
+                <w:b/>
+              </w:rPr>
+              <w:t>Chat App</w:t>
+            </w:r>
+          </w:p>
+        </w:tc>
+        <w:tc>
+          <w:tcPr>
+            <w:tcW w:type="dxa" w:w="2160"/>
+          </w:tcPr>
+          <w:p>
+            <w:r/>
+            <w:r>
+              <w:t>Persistent WebSockets + per-conversation seq numbers + shared broker to route across gateways</w:t>
+            </w:r>
+          </w:p>
+        </w:tc>
+        <w:tc>
+          <w:tcPr>
+            <w:tcW w:type="dxa" w:w="2160"/>
+          </w:tcPr>
+          <w:p>
+            <w:r/>
+            <w:r>
+              <w:t>Stateful connection tables (deliberate exception)</w:t>
+            </w:r>
+          </w:p>
+        </w:tc>
+      </w:tr>
+      <w:tr>
+        <w:tc>
+          <w:tcPr>
+            <w:tcW w:type="dxa" w:w="2160"/>
+          </w:tcPr>
+          <w:p>
+            <w:r/>
+            <w:r>
+              <w:t>4</w:t>
+            </w:r>
+          </w:p>
+        </w:tc>
+        <w:tc>
+          <w:tcPr>
+            <w:tcW w:type="dxa" w:w="2160"/>
+          </w:tcPr>
+          <w:p>
+            <w:r/>
+            <w:r>
+              <w:rPr>
+                <w:b/>
+              </w:rPr>
+              <w:t>News Feed</w:t>
+            </w:r>
+          </w:p>
+        </w:tc>
+        <w:tc>
+          <w:tcPr>
+            <w:tcW w:type="dxa" w:w="2160"/>
+          </w:tcPr>
+          <w:p>
+            <w:r/>
+            <w:r>
+              <w:t>Hybrid: push for normal users, pull/merge-at-read for celebrities</w:t>
+            </w:r>
+          </w:p>
+        </w:tc>
+        <w:tc>
+          <w:tcPr>
+            <w:tcW w:type="dxa" w:w="2160"/>
+          </w:tcPr>
+          <w:p>
+            <w:r/>
+            <w:r>
+              <w:t>Write storm (push) vs read-time compute (pull)</w:t>
+            </w:r>
+          </w:p>
+        </w:tc>
+      </w:tr>
+      <w:tr>
+        <w:tc>
+          <w:tcPr>
+            <w:tcW w:type="dxa" w:w="2160"/>
+          </w:tcPr>
+          <w:p>
+            <w:r/>
+            <w:r>
+              <w:t>5</w:t>
+            </w:r>
+          </w:p>
+        </w:tc>
+        <w:tc>
+          <w:tcPr>
+            <w:tcW w:type="dxa" w:w="2160"/>
+          </w:tcPr>
+          <w:p>
+            <w:r/>
+            <w:r>
+              <w:rPr>
+                <w:b/>
+              </w:rPr>
+              <w:t>Notification System</w:t>
+            </w:r>
+          </w:p>
+        </w:tc>
+        <w:tc>
+          <w:tcPr>
+            <w:tcW w:type="dxa" w:w="2160"/>
+          </w:tcPr>
+          <w:p>
+            <w:r/>
+            <w:r>
+              <w:t>Pub/sub fan-out; one worker pool per channel; DLQ + backoff</w:t>
+            </w:r>
+          </w:p>
+        </w:tc>
+        <w:tc>
+          <w:tcPr>
+            <w:tcW w:type="dxa" w:w="2160"/>
+          </w:tcPr>
+          <w:p>
+            <w:r/>
+            <w:r>
+              <w:t>Slow provider blocking others; per-user spam → debounce</w:t>
+            </w:r>
+          </w:p>
+        </w:tc>
+      </w:tr>
+      <w:tr>
+        <w:tc>
+          <w:tcPr>
+            <w:tcW w:type="dxa" w:w="2160"/>
+          </w:tcPr>
+          <w:p>
+            <w:r/>
+            <w:r>
+              <w:t>6</w:t>
+            </w:r>
+          </w:p>
+        </w:tc>
+        <w:tc>
+          <w:tcPr>
+            <w:tcW w:type="dxa" w:w="2160"/>
+          </w:tcPr>
+          <w:p>
+            <w:r/>
+            <w:r>
+              <w:rPr>
+                <w:b/>
+              </w:rPr>
+              <w:t>Web Crawler</w:t>
+            </w:r>
+          </w:p>
+        </w:tc>
+        <w:tc>
+          <w:tcPr>
+            <w:tcW w:type="dxa" w:w="2160"/>
+          </w:tcPr>
+          <w:p>
+            <w:r/>
+            <w:r>
+              <w:t>Distributed URL frontier, per-domain rate-limited queues; Bloom filter dedup</w:t>
+            </w:r>
+          </w:p>
+        </w:tc>
+        <w:tc>
+          <w:tcPr>
+            <w:tcW w:type="dxa" w:w="2160"/>
+          </w:tcPr>
+          <w:p>
+            <w:r/>
+            <w:r>
+              <w:t>Frontier throughput → shard by domain hash</w:t>
+            </w:r>
+          </w:p>
+        </w:tc>
+      </w:tr>
+      <w:tr>
+        <w:tc>
+          <w:tcPr>
+            <w:tcW w:type="dxa" w:w="2160"/>
+          </w:tcPr>
+          <w:p>
+            <w:r/>
+            <w:r>
+              <w:t>7</w:t>
+            </w:r>
+          </w:p>
+        </w:tc>
+        <w:tc>
+          <w:tcPr>
+            <w:tcW w:type="dxa" w:w="2160"/>
+          </w:tcPr>
+          <w:p>
+            <w:r/>
+            <w:r>
+              <w:rPr>
+                <w:b/>
+              </w:rPr>
+              <w:t>File Storage (Dropbox)</w:t>
+            </w:r>
+          </w:p>
+        </w:tc>
+        <w:tc>
+          <w:tcPr>
+            <w:tcW w:type="dxa" w:w="2160"/>
+          </w:tcPr>
+          <w:p>
+            <w:r/>
+            <w:r>
+              <w:t>Content-hashed chunking (dedup + delta sync) + metadata/blob split + version vectors</w:t>
+            </w:r>
+          </w:p>
+        </w:tc>
+        <w:tc>
+          <w:tcPr>
+            <w:tcW w:type="dxa" w:w="2160"/>
+          </w:tcPr>
+          <w:p>
+            <w:r/>
+            <w:r>
+              <w:t>Metadata query load if mixed with blob bytes</w:t>
+            </w:r>
+          </w:p>
+        </w:tc>
+      </w:tr>
+      <w:tr>
+        <w:tc>
+          <w:tcPr>
+            <w:tcW w:type="dxa" w:w="2160"/>
+          </w:tcPr>
+          <w:p>
+            <w:r/>
+            <w:r>
+              <w:t>8</w:t>
+            </w:r>
+          </w:p>
+        </w:tc>
+        <w:tc>
+          <w:tcPr>
+            <w:tcW w:type="dxa" w:w="2160"/>
+          </w:tcPr>
+          <w:p>
+            <w:r/>
+            <w:r>
+              <w:rPr>
+                <w:b/>
+              </w:rPr>
+              <w:t>Ride-Sharing (Uber)</w:t>
+            </w:r>
+          </w:p>
+        </w:tc>
+        <w:tc>
+          <w:tcPr>
+            <w:tcW w:type="dxa" w:w="2160"/>
+          </w:tcPr>
+          <w:p>
+            <w:r/>
+            <w:r>
+              <w:t>Geohash/quadtree index in-memory (Redis geo); expanding-radius query; ETA-aware ranking</w:t>
+            </w:r>
+          </w:p>
+        </w:tc>
+        <w:tc>
+          <w:tcPr>
+            <w:tcW w:type="dxa" w:w="2160"/>
+          </w:tcPr>
+          <w:p>
+            <w:r/>
+            <w:r>
+              <w:t>Location-ping write volume → shard geo index by region</w:t>
+            </w:r>
+          </w:p>
+        </w:tc>
+      </w:tr>
+      <w:tr>
+        <w:tc>
+          <w:tcPr>
+            <w:tcW w:type="dxa" w:w="2160"/>
+          </w:tcPr>
+          <w:p>
+            <w:r/>
+            <w:r>
+              <w:t>9</w:t>
+            </w:r>
+          </w:p>
+        </w:tc>
+        <w:tc>
+          <w:tcPr>
+            <w:tcW w:type="dxa" w:w="2160"/>
+          </w:tcPr>
+          <w:p>
+            <w:r/>
+            <w:r>
+              <w:rPr>
+                <w:b/>
+              </w:rPr>
+              <w:t>Proximity (Yelp)</w:t>
+            </w:r>
+          </w:p>
+        </w:tc>
+        <w:tc>
+          <w:tcPr>
+            <w:tcW w:type="dxa" w:w="2160"/>
+          </w:tcPr>
+          <w:p>
+            <w:r/>
+            <w:r>
+              <w:t>Geohash index + aggressive caching of popular cells; simple TTL invalidation</w:t>
+            </w:r>
+          </w:p>
+        </w:tc>
+        <w:tc>
+          <w:tcPr>
+            <w:tcW w:type="dxa" w:w="2160"/>
+          </w:tcPr>
+          <w:p>
+            <w:r/>
+            <w:r>
+              <w:t>Read volume on hot areas; static data → cache-friendly</w:t>
+            </w:r>
+          </w:p>
+        </w:tc>
+      </w:tr>
+      <w:tr>
+        <w:tc>
+          <w:tcPr>
+            <w:tcW w:type="dxa" w:w="2160"/>
+          </w:tcPr>
+          <w:p>
+            <w:r/>
+            <w:r>
+              <w:t>10</w:t>
+            </w:r>
+          </w:p>
+        </w:tc>
+        <w:tc>
+          <w:tcPr>
+            <w:tcW w:type="dxa" w:w="2160"/>
+          </w:tcPr>
+          <w:p>
+            <w:r/>
+            <w:r>
+              <w:rPr>
+                <w:b/>
+              </w:rPr>
+              <w:t>Video Streaming</w:t>
+            </w:r>
+          </w:p>
+        </w:tc>
+        <w:tc>
+          <w:tcPr>
+            <w:tcW w:type="dxa" w:w="2160"/>
+          </w:tcPr>
+          <w:p>
+            <w:r/>
+            <w:r>
+              <w:t>Async transcoding pipeline + CDN edge delivery + segmented ABR</w:t>
+            </w:r>
+          </w:p>
+        </w:tc>
+        <w:tc>
+          <w:tcPr>
+            <w:tcW w:type="dxa" w:w="2160"/>
+          </w:tcPr>
+          <w:p>
+            <w:r/>
+            <w:r>
+              <w:t>Encoding cost/time; # of bitrate tiers vs experience</w:t>
+            </w:r>
+          </w:p>
+        </w:tc>
+      </w:tr>
+      <w:tr>
+        <w:tc>
+          <w:tcPr>
+            <w:tcW w:type="dxa" w:w="2160"/>
+          </w:tcPr>
+          <w:p>
+            <w:r/>
+            <w:r>
+              <w:t>11</w:t>
+            </w:r>
+          </w:p>
+        </w:tc>
+        <w:tc>
+          <w:tcPr>
+            <w:tcW w:type="dxa" w:w="2160"/>
+          </w:tcPr>
+          <w:p>
+            <w:r/>
+            <w:r>
+              <w:rPr>
+                <w:b/>
+              </w:rPr>
+              <w:t>E-Commerce Checkout</w:t>
+            </w:r>
+          </w:p>
+        </w:tc>
+        <w:tc>
+          <w:tcPr>
+            <w:tcW w:type="dxa" w:w="2160"/>
+          </w:tcPr>
+          <w:p>
+            <w:r/>
+            <w:r>
+              <w:t>Saga: chained local transactions + events + compensating actions</w:t>
+            </w:r>
+          </w:p>
+        </w:tc>
+        <w:tc>
+          <w:tcPr>
+            <w:tcW w:type="dxa" w:w="2160"/>
+          </w:tcPr>
+          <w:p>
+            <w:r/>
+            <w:r>
+              <w:t>Last-unit inventory contention → atomic conditional decrement</w:t>
+            </w:r>
+          </w:p>
+        </w:tc>
+      </w:tr>
+      <w:tr>
+        <w:tc>
+          <w:tcPr>
+            <w:tcW w:type="dxa" w:w="2160"/>
+          </w:tcPr>
+          <w:p>
+            <w:r/>
+            <w:r>
+              <w:t>12</w:t>
+            </w:r>
+          </w:p>
+        </w:tc>
+        <w:tc>
+          <w:tcPr>
+            <w:tcW w:type="dxa" w:w="2160"/>
+          </w:tcPr>
+          <w:p>
+            <w:r/>
+            <w:r>
+              <w:rPr>
+                <w:b/>
+              </w:rPr>
+              <w:t>Payment System</w:t>
+            </w:r>
+          </w:p>
+        </w:tc>
+        <w:tc>
+          <w:tcPr>
+            <w:tcW w:type="dxa" w:w="2160"/>
+          </w:tcPr>
+          <w:p>
+            <w:r/>
+            <w:r>
+              <w:t>Idempotency key → stored result; periodic ledger-vs-provider reconciliation</w:t>
+            </w:r>
+          </w:p>
+        </w:tc>
+        <w:tc>
+          <w:tcPr>
+            <w:tcW w:type="dxa" w:w="2160"/>
+          </w:tcPr>
+          <w:p>
+            <w:r/>
+            <w:r>
+              <w:t>Ambiguous outcomes under network failure (at-least-once + idempotency, not exactly-once)</w:t>
+            </w:r>
+          </w:p>
+        </w:tc>
+      </w:tr>
+      <w:tr>
+        <w:tc>
+          <w:tcPr>
+            <w:tcW w:type="dxa" w:w="2160"/>
+          </w:tcPr>
+          <w:p>
+            <w:r/>
+            <w:r>
+              <w:t>13</w:t>
+            </w:r>
+          </w:p>
+        </w:tc>
+        <w:tc>
+          <w:tcPr>
+            <w:tcW w:type="dxa" w:w="2160"/>
+          </w:tcPr>
+          <w:p>
+            <w:r/>
+            <w:r>
+              <w:rPr>
+                <w:b/>
+              </w:rPr>
+              <w:t>Ticket Booking</w:t>
+            </w:r>
+          </w:p>
+        </w:tc>
+        <w:tc>
+          <w:tcPr>
+            <w:tcW w:type="dxa" w:w="2160"/>
+          </w:tcPr>
+          <w:p>
+            <w:r/>
+            <w:r>
+              <w:t xml:space="preserve">Per-seat Redis </w:t>
+            </w:r>
+            <w:r>
+              <w:rPr>
+                <w:rFonts w:ascii="Consolas" w:hAnsi="Consolas"/>
+                <w:color w:val="B03060"/>
+              </w:rPr>
+              <w:t>SET NX EX</w:t>
+            </w:r>
+            <w:r>
+              <w:t xml:space="preserve"> lock with TTL hold; finalize only on payment success</w:t>
+            </w:r>
+          </w:p>
+        </w:tc>
+        <w:tc>
+          <w:tcPr>
+            <w:tcW w:type="dxa" w:w="2160"/>
+          </w:tcPr>
+          <w:p>
+            <w:r/>
+            <w:r>
+              <w:t>Lock granularity — coarser than per-seat kills throughput</w:t>
+            </w:r>
+          </w:p>
+        </w:tc>
+      </w:tr>
+      <w:tr>
+        <w:tc>
+          <w:tcPr>
+            <w:tcW w:type="dxa" w:w="2160"/>
+          </w:tcPr>
+          <w:p>
+            <w:r/>
+            <w:r>
+              <w:t>14</w:t>
+            </w:r>
+          </w:p>
+        </w:tc>
+        <w:tc>
+          <w:tcPr>
+            <w:tcW w:type="dxa" w:w="2160"/>
+          </w:tcPr>
+          <w:p>
+            <w:r/>
+            <w:r>
+              <w:rPr>
+                <w:b/>
+              </w:rPr>
+              <w:t>Autocomplete</w:t>
+            </w:r>
+          </w:p>
+        </w:tc>
+        <w:tc>
+          <w:tcPr>
+            <w:tcW w:type="dxa" w:w="2160"/>
+          </w:tcPr>
+          <w:p>
+            <w:r/>
+            <w:r>
+              <w:t>In-memory trie, precomputed top-k per node; hourly offline rebuild; hot-prefix cache</w:t>
+            </w:r>
+          </w:p>
+        </w:tc>
+        <w:tc>
+          <w:tcPr>
+            <w:tcW w:type="dxa" w:w="2160"/>
+          </w:tcPr>
+          <w:p>
+            <w:r/>
+            <w:r>
+              <w:t>Freshness vs a read path that never touches a DB</w:t>
+            </w:r>
+          </w:p>
+        </w:tc>
+      </w:tr>
+      <w:tr>
+        <w:tc>
+          <w:tcPr>
+            <w:tcW w:type="dxa" w:w="2160"/>
+          </w:tcPr>
+          <w:p>
+            <w:r/>
+            <w:r>
+              <w:t>15</w:t>
+            </w:r>
+          </w:p>
+        </w:tc>
+        <w:tc>
+          <w:tcPr>
+            <w:tcW w:type="dxa" w:w="2160"/>
+          </w:tcPr>
+          <w:p>
+            <w:r/>
+            <w:r>
+              <w:rPr>
+                <w:b/>
+              </w:rPr>
+              <w:t>Distributed Cache</w:t>
+            </w:r>
+          </w:p>
+        </w:tc>
+        <w:tc>
+          <w:tcPr>
+            <w:tcW w:type="dxa" w:w="2160"/>
+          </w:tcPr>
+          <w:p>
+            <w:r/>
+            <w:r>
+              <w:t>Consistent hashing on a ring + virtual nodes + replicate to next 1–2 nodes</w:t>
+            </w:r>
+          </w:p>
+        </w:tc>
+        <w:tc>
+          <w:tcPr>
+            <w:tcW w:type="dxa" w:w="2160"/>
+          </w:tcPr>
+          <w:p>
+            <w:r/>
+            <w:r>
+              <w:t>Rehash storm on node add/remove (the ring solves it)</w:t>
+            </w:r>
+          </w:p>
+        </w:tc>
+      </w:tr>
+      <w:tr>
+        <w:tc>
+          <w:tcPr>
+            <w:tcW w:type="dxa" w:w="2160"/>
+          </w:tcPr>
+          <w:p>
+            <w:r/>
+            <w:r>
+              <w:t>16</w:t>
+            </w:r>
+          </w:p>
+        </w:tc>
+        <w:tc>
+          <w:tcPr>
+            <w:tcW w:type="dxa" w:w="2160"/>
+          </w:tcPr>
+          <w:p>
+            <w:r/>
+            <w:r>
+              <w:rPr>
+                <w:b/>
+              </w:rPr>
+              <w:t>Key-Value Store (Dynamo)</w:t>
+            </w:r>
+          </w:p>
+        </w:tc>
+        <w:tc>
+          <w:tcPr>
+            <w:tcW w:type="dxa" w:w="2160"/>
+          </w:tcPr>
+          <w:p>
+            <w:r/>
+            <w:r>
+              <w:t xml:space="preserve">Consistent-hash partitioning + N replicas + quorum </w:t>
+            </w:r>
+            <w:r>
+              <w:rPr>
+                <w:rFonts w:ascii="Consolas" w:hAnsi="Consolas"/>
+                <w:color w:val="B03060"/>
+              </w:rPr>
+              <w:t>W+R&gt;N</w:t>
+            </w:r>
+            <w:r>
+              <w:t xml:space="preserve"> + hinted handoff</w:t>
+            </w:r>
+          </w:p>
+        </w:tc>
+        <w:tc>
+          <w:tcPr>
+            <w:tcW w:type="dxa" w:w="2160"/>
+          </w:tcPr>
+          <w:p>
+            <w:r/>
+            <w:r>
+              <w:t>Coordination cost of strong-consistency quorums; per-request consistency choice</w:t>
+            </w:r>
+          </w:p>
+        </w:tc>
+      </w:tr>
+      <w:tr>
+        <w:tc>
+          <w:tcPr>
+            <w:tcW w:type="dxa" w:w="2160"/>
+          </w:tcPr>
+          <w:p>
+            <w:r/>
+            <w:r>
+              <w:t>17</w:t>
+            </w:r>
+          </w:p>
+        </w:tc>
+        <w:tc>
+          <w:tcPr>
+            <w:tcW w:type="dxa" w:w="2160"/>
+          </w:tcPr>
+          <w:p>
+            <w:r/>
+            <w:r>
+              <w:rPr>
+                <w:b/>
+              </w:rPr>
+              <w:t>Log / Metrics Aggregation</w:t>
+            </w:r>
+          </w:p>
+        </w:tc>
+        <w:tc>
+          <w:tcPr>
+            <w:tcW w:type="dxa" w:w="2160"/>
+          </w:tcPr>
+          <w:p>
+            <w:r/>
+            <w:r>
+              <w:t>Sidecar → Kafka → stream processor → time-series DB; tiered downsampling by age</w:t>
+            </w:r>
+          </w:p>
+        </w:tc>
+        <w:tc>
+          <w:tcPr>
+            <w:tcW w:type="dxa" w:w="2160"/>
+          </w:tcPr>
+          <w:p>
+            <w:r/>
+            <w:r>
+              <w:t>Write throughput → decouple ingest with a queue; retention vs cost</w:t>
+            </w:r>
+          </w:p>
+        </w:tc>
+      </w:tr>
+      <w:tr>
+        <w:tc>
+          <w:tcPr>
+            <w:tcW w:type="dxa" w:w="2160"/>
+          </w:tcPr>
+          <w:p>
+            <w:r/>
+            <w:r>
+              <w:t>18</w:t>
+            </w:r>
+          </w:p>
+        </w:tc>
+        <w:tc>
+          <w:tcPr>
+            <w:tcW w:type="dxa" w:w="2160"/>
+          </w:tcPr>
+          <w:p>
+            <w:r/>
+            <w:r>
+              <w:rPr>
+                <w:b/>
+              </w:rPr>
+              <w:t>Job Scheduler (cron at scale)</w:t>
+            </w:r>
+          </w:p>
+        </w:tc>
+        <w:tc>
+          <w:tcPr>
+            <w:tcW w:type="dxa" w:w="2160"/>
+          </w:tcPr>
+          <w:p>
+            <w:r/>
+            <w:r>
+              <w:t xml:space="preserve">Leader election (Raft/etcd) for dispatch + per-job </w:t>
+            </w:r>
+            <w:r>
+              <w:rPr>
+                <w:rFonts w:ascii="Consolas" w:hAnsi="Consolas"/>
+                <w:color w:val="B03060"/>
+              </w:rPr>
+              <w:t>SET NX EX</w:t>
+            </w:r>
+            <w:r>
+              <w:t xml:space="preserve"> lock as backstop</w:t>
+            </w:r>
+          </w:p>
+        </w:tc>
+        <w:tc>
+          <w:tcPr>
+            <w:tcW w:type="dxa" w:w="2160"/>
+          </w:tcPr>
+          <w:p>
+            <w:r/>
+            <w:r>
+              <w:t>Brief dual-leader window in a partition → the lock is the real guarantee</w:t>
+            </w:r>
+          </w:p>
+        </w:tc>
+      </w:tr>
+      <w:tr>
+        <w:tc>
+          <w:tcPr>
+            <w:tcW w:type="dxa" w:w="2160"/>
+          </w:tcPr>
+          <w:p>
+            <w:r/>
+            <w:r>
+              <w:t>19</w:t>
+            </w:r>
+          </w:p>
+        </w:tc>
+        <w:tc>
+          <w:tcPr>
+            <w:tcW w:type="dxa" w:w="2160"/>
+          </w:tcPr>
+          <w:p>
+            <w:r/>
+            <w:r>
+              <w:rPr>
+                <w:b/>
+              </w:rPr>
+              <w:t>ID Generator (Snowflake)</w:t>
+            </w:r>
+          </w:p>
+        </w:tc>
+        <w:tc>
+          <w:tcPr>
+            <w:tcW w:type="dxa" w:w="2160"/>
+          </w:tcPr>
+          <w:p>
+            <w:r/>
+            <w:r>
+              <w:t>64-bit: timestamp · pre-assigned machine_id · per-ms sequence — zero coordination</w:t>
+            </w:r>
+          </w:p>
+        </w:tc>
+        <w:tc>
+          <w:tcPr>
+            <w:tcW w:type="dxa" w:w="2160"/>
+          </w:tcPr>
+          <w:p>
+            <w:r/>
+            <w:r>
+              <w:t>Clock skew / backward NTP jumps → pause generation</w:t>
+            </w:r>
+          </w:p>
+        </w:tc>
+      </w:tr>
+      <w:tr>
+        <w:tc>
+          <w:tcPr>
+            <w:tcW w:type="dxa" w:w="2160"/>
+          </w:tcPr>
+          <w:p>
+            <w:r/>
+            <w:r>
+              <w:t>20</w:t>
+            </w:r>
+          </w:p>
+        </w:tc>
+        <w:tc>
+          <w:tcPr>
+            <w:tcW w:type="dxa" w:w="2160"/>
+          </w:tcPr>
+          <w:p>
+            <w:r/>
+            <w:r>
+              <w:rPr>
+                <w:b/>
+              </w:rPr>
+              <w:t>Full Platform Capstone</w:t>
+            </w:r>
+          </w:p>
+        </w:tc>
+        <w:tc>
+          <w:tcPr>
+            <w:tcW w:type="dxa" w:w="2160"/>
+          </w:tcPr>
+          <w:p>
+            <w:r/>
+            <w:r>
+              <w:t>Event bus behind the Post service; every subsystem is an independent async consumer</w:t>
+            </w:r>
+          </w:p>
+        </w:tc>
+        <w:tc>
+          <w:tcPr>
+            <w:tcW w:type="dxa" w:w="2160"/>
+          </w:tcPr>
+          <w:p>
+            <w:r/>
+            <w:r>
+              <w:t>Synchronous coupling (the bus avoids it); name it early</w:t>
+            </w:r>
+          </w:p>
+        </w:tc>
+      </w:tr>
+    </w:tbl>
     <w:p>
       <w:pPr>
         <w:pStyle w:val="Heading3"/>
@@ -2198,7 +3298,43 @@
         <w:rPr>
           <w:i/>
         </w:rPr>
-        <w:t>⏳ RAG Q&amp;A · LLM serving (batching / GPU / queue) · recommender · agent orchestration.</w:t>
+        <w:t xml:space="preserve">⏳ Drill with </w:t>
+      </w:r>
+      <w:r>
+        <w:rPr>
+          <w:rFonts w:ascii="Consolas" w:hAnsi="Consolas"/>
+          <w:i/>
+          <w:color w:val="B03060"/>
+        </w:rPr>
+        <w:t>/study SD-AI-1..4</w:t>
+      </w:r>
+      <w:r>
+        <w:rPr>
+          <w:i/>
+        </w:rPr>
+        <w:t>. RAG Q&amp;A · LLM serving (batching / GPU / queue) ·</w:t>
+      </w:r>
+    </w:p>
+    <w:p>
+      <w:pPr>
+        <w:ind w:left="240"/>
+      </w:pPr>
+      <w:r>
+        <w:rPr>
+          <w:i/>
+        </w:rPr>
+        <w:t>recommender (candidate-gen vs ranking, feature store) · agent orchestration</w:t>
+      </w:r>
+    </w:p>
+    <w:p>
+      <w:pPr>
+        <w:ind w:left="240"/>
+      </w:pPr>
+      <w:r>
+        <w:rPr>
+          <w:i/>
+        </w:rPr>
+        <w:t>(tool loop, state, mid-conversation failure).</w:t>
       </w:r>
     </w:p>
     <w:sectPr>

</xml_diff>